<commit_message>
Manuscript files with release hash; figures for journal upload
Co-Authored-By: Claude Opus 5.5 <noreply@anthropic.com>
</commit_message>
<xml_diff>
--- a/manuscript/Paper2_revised_review.docx
+++ b/manuscript/Paper2_revised_review.docx
@@ -12,7 +12,7 @@
           <w:i w:val="0"/>
           <w:sz w:val="28"/>
         </w:rPr>
-        <w:t>Utah FORGE downhole microearthquake codas require small-scale 3-D heterogeneity: elastic tests of smooth, layered, fracture-zone and stochastic media</w:t>
+        <w:t>Late S-wave energy and decorrelation in Utah FORGE downhole microearthquakes: elastic tests of smooth, layered, fracture-zone and stochastic media</w:t>
       </w:r>
     </w:p>
     <w:p>
@@ -39,7 +39,7 @@
           <w:b w:val="0"/>
           <w:i w:val="0"/>
         </w:rPr>
-        <w:t>, Peter Leary</w:t>
+        <w:t xml:space="preserve"> and Peter Leary</w:t>
       </w:r>
       <w:r>
         <w:rPr>
@@ -48,13 +48,6 @@
           <w:vertAlign w:val="superscript"/>
         </w:rPr>
         <w:t>2</w:t>
-      </w:r>
-      <w:r>
-        <w:rPr>
-          <w:b w:val="0"/>
-          <w:i w:val="0"/>
-        </w:rPr>
-        <w:t>, [AUTHOR LIST TO BE CONFIRMED BY ALL AUTHORS BEFORE SUBMISSION]</w:t>
       </w:r>
     </w:p>
     <w:p>
@@ -140,7 +133,7 @@
           <w:b w:val="0"/>
           <w:i w:val="0"/>
         </w:rPr>
-        <w:t>Downhole records of microearthquakes (MEQs) induced by the April 2022 stimulation at Utah FORGE contain long S-wave codas. We test which elastic media reproduce them. 416 MEQs recorded at 4 kHz by two three-component sensors in well 56-32 are compared with 3-D finite-difference wavefields computed by reciprocity for smooth media (homogeneous, 50-m sonic-log layering, 3-D gradients, transverse isotropy), deterministic small-scale media (6-m sonic-log layering, 5-m-thick fracture zones) and lognormal stochastic media with power-law, exponential and Gaussian spectra. Moment tensors fitted to the direct waves (P − 10 ms to S + 15 ms) predict the 40–80 Hz energy from S + 40 to S + 100 ms. The smooth media under-predict this late energy by median factors of 44–82 at the upper and 12–15 at the lower sensor. This deficit persists for alternative windows, deviatoric and double-couple sources, finite source duration, well-timed events and a worst-case in-band tool resonance; the simulated coda is converged in grid and absorbing boundary. Thin layers and fracture zones reduce it to factors of 11–19 (upper) and 2.4–3.4 (lower sensor), and stochastic media match it. The observed coda decorrelates between neighbouring events (0.69 to 0.49 from 0–5 to 80–160 m), whereas smooth and deterministic small-scale media keep it coherent (≥ 0.79) and stochastic media decorrelate it. Within the isotropic lognormal model class, the late energy implies an effective scattering strength σ</w:t>
+        <w:t>Downhole records of microearthquakes (MEQs) induced by the April 2022 stimulation at Utah FORGE contain long S-wave codas. 416 MEQs recorded at 4 kHz by two three-component sensors in well 56-32 are compared with 3-D finite-difference wavefields computed by reciprocity for smooth media (homogeneous, 50-m sonic-log layering, 3-D gradients, transverse isotropy), deterministic small-scale media (6-m sonic-log layering, 5-m-thick fracture zones) and lognormal stochastic media with power-law, exponential and Gaussian spectra. Moment tensors fitted to the direct waves (P − 10 ms to S + 15 ms) predict the 40–80 Hz energy from S + 40 to S + 100 ms. The smooth media under-predict this late energy by median factors of 44–82 at the upper and 12–15 at the lower sensor, robustly to windows, source constraints, source duration, event timing and a worst-case in-band tool resonance. Thin layers and fracture zones reduce it to factors of 11–19 (upper) and 2.4–3.4 (lower sensor); stochastic media span the observed late-energy distributions. In the early coda the waveforms of neighbouring events decorrelate with separation, as in the stochastic media, whereas the tested smooth and simple deterministic media stay coherent. In the pure late coda all media approach the noise level, and only the smooth media and the planar fracture zones remain more coherent than the data. The late energy implies an effective scattering strength σ</w:t>
       </w:r>
       <w:r>
         <w:rPr>
@@ -169,7 +162,7 @@
           <w:b w:val="0"/>
           <w:i w:val="0"/>
         </w:rPr>
-        <w:t>), depending on sensor and spectral family. A larger simulation domain raises the stochastic coda, so these values are upper bounds, comparable to the sonic-log value of 0.045. At 20–80 Hz neither per-event nor common-grid statistical comparisons (event bootstrap, holdout) distinguish power-law from exponential or Gaussian spectra, and the sonic-log spectrum (β = 0.85 ± 0.07 over 12–200 m) does not exclude a short correlation length. Within elastic modelling, the late S energy thus requires strong small-scale 3-D heterogeneity, unless an unmodelled site response of comparable size is present; its spectral form is not resolved. Deterministic comparison against an unknown stochastic realisation favours smooth media, so medium-class selection should use wavefield statistics.</w:t>
+        <w:t>), depending on sensor and family; one domain-size test suggests that these are upper bounds, comparable to the sonic-log value of 0.045. At 20–80 Hz neither per-event nor common-grid statistical comparisons (event bootstrap, holdout) distinguish power-law from exponential or Gaussian spectra, and the sonic-log spectrum (β = 0.85 ± 0.07 over 12–200 m) does not exclude a short correlation length. Within elastic modelling, the late S energy thus requires structure at the 5–10 m scale, and its decorrelation favours distributed 3-D heterogeneity without excluding fine layering, unless an unmodelled site response of comparable size is present; the spectral form is not resolved. Deterministic comparison against an unknown stochastic realisation favours smooth media, so medium-class selection should use wavefield statistics.</w:t>
       </w:r>
     </w:p>
     <w:p>
@@ -959,7 +952,7 @@
       <w:r>
         <w:drawing>
           <wp:inline xmlns:a="http://schemas.openxmlformats.org/drawingml/2006/main" xmlns:pic="http://schemas.openxmlformats.org/drawingml/2006/picture">
-            <wp:extent cx="5940000" cy="2993203"/>
+            <wp:extent cx="5940000" cy="2285308"/>
             <wp:docPr id="1" name="Picture 1"/>
             <wp:cNvGraphicFramePr>
               <a:graphicFrameLocks noChangeAspect="1"/>
@@ -968,7 +961,7 @@
               <a:graphicData uri="http://schemas.openxmlformats.org/drawingml/2006/picture">
                 <pic:pic>
                   <pic:nvPicPr>
-                    <pic:cNvPr id="0" name="fig_geometry.png"/>
+                    <pic:cNvPr id="0" name="fig_geometry_rev.png"/>
                     <pic:cNvPicPr/>
                   </pic:nvPicPr>
                   <pic:blipFill>
@@ -980,7 +973,7 @@
                   <pic:spPr>
                     <a:xfrm>
                       <a:off x="0" y="0"/>
-                      <a:ext cx="5940000" cy="2993203"/>
+                      <a:ext cx="5940000" cy="2285308"/>
                     </a:xfrm>
                     <a:prstGeom prst="rect"/>
                   </pic:spPr>
@@ -1015,7 +1008,7 @@
           <w:b w:val="0"/>
           <w:i w:val="0"/>
         </w:rPr>
-        <w:t>a) Catalogued MEQs inside the FD interior (colour = stimulation stage), the calibrated sensors A and B (red triangles) and the FD interior (dotted box). b) Hypocentral distances to sensors A and B.</w:t>
+        <w:t>a) Map view and b) east–depth section of the 416 analysed MEQs (orange: stage 3; blue: stage 2) and of the other catalogued events inside the FD interior (grey), with the calibrated sensors A and B in well 56-32 (red triangles) and the FD interior (dotted). Coordinates relative to the 16A(78)-32 wellhead. c) Hypocentral distances of the 416 events to sensors A and B.</w:t>
       </w:r>
     </w:p>
     <w:p>
@@ -1025,7 +1018,7 @@
       <w:r>
         <w:drawing>
           <wp:inline xmlns:a="http://schemas.openxmlformats.org/drawingml/2006/main" xmlns:pic="http://schemas.openxmlformats.org/drawingml/2006/picture">
-            <wp:extent cx="5940000" cy="3918253"/>
+            <wp:extent cx="5940000" cy="4155195"/>
             <wp:docPr id="2" name="Picture 2"/>
             <wp:cNvGraphicFramePr>
               <a:graphicFrameLocks noChangeAspect="1"/>
@@ -1046,7 +1039,7 @@
                   <pic:spPr>
                     <a:xfrm>
                       <a:off x="0" y="0"/>
-                      <a:ext cx="5940000" cy="3918253"/>
+                      <a:ext cx="5940000" cy="4155195"/>
                     </a:xfrm>
                     <a:prstGeom prst="rect"/>
                   </pic:spPr>
@@ -4356,7 +4349,7 @@
           <w:b w:val="0"/>
           <w:i w:val="0"/>
         </w:rPr>
-        <w:t>For pairs of events recorded on the same sensor, D2 is the maximum normalised two-component cross-correlation (lag ±8 ms) of the 40–80 Hz window S + 15 to S + 100 ms, summarised as the median in bins of inter-event separation (0–5 to 80–160 m). Pairs that share an event are not independent, so 95 % intervals come from a cluster bootstrap over events (each resampled event carries all its pairs). To test sensitivity to catalogue location error, the separations were recomputed after perturbing every hypocentre by 5 and 10 m.</w:t>
+        <w:t>For pairs of events recorded on the same sensor, D2 is the maximum normalised two-component cross-correlation (lag ±8 ms) of a 40–80 Hz coda window, summarised as the median in bins of inter-event separation (0–5 to 80–160 m) and as the median over all pairs within 160 m. Three windows are used: S + 15 to S + 100 ms (early coda, including the tail of the S pulse), S + 40 to S + 100 ms (the window of the late-energy test) and S + 50 to S + 110 ms. The coherence of noise alone is measured on the same records in a window S + 550 to S + 610 ms. Every synthetic record contains that event's own recorded noise at its observed SNR, so the noise contribution is common to data and media. Pairs that share an event are not independent, so 95 % intervals come from a cluster bootstrap over events (each resampled event carries all its pairs). To test sensitivity to location error, the hypocentres used for binning were perturbed by isotropic Gaussian errors of 5, 10, 20, 30 and 50 m, for data and media alike. The all-pairs median does not depend on the binning and is therefore insensitive to location error.</w:t>
       </w:r>
     </w:p>
     <w:p>
@@ -4444,7 +4437,7 @@
           <w:b w:val="0"/>
           <w:i w:val="0"/>
         </w:rPr>
-        <w:t>Deterministic small-scale structure changes this substantially. The sonic log at its 6-m resolution (L6) gives −1.28/−0.53, and the thin fracture zones (FZ) give −1.04/−0.39: under-prediction by factors of 19 and 11 at sensor A but only 3.4 and 2.4 at sensor B, where 41 % and 45 % of events fall within a factor of three. Averaging the log in 50-m blocks, as in the original analysis, therefore removed most of the late energy that the logged layering can generate. For the level of late energy, structure at the 5–10 m scale is the essential ingredient, whether it is layered, planar or random. Stochastic media span the observations: pink media with σ = 0.02 under-predict (−1.20/−0.49), σ = 0.09 is close at sensor A (−0.14) and σ = 0.045 at sensor B (+0.02), and the seed-11 stochastic media with σ = 0.13 over-predict (+0.28 to +1.12). The best stochastic media bring 53 % (A) and 54 % (B) of events within a factor of three. The residual scatter reflects the unknown realisation. No single medium matches the median at both sensors; for the pink family, sensor B requires about half the σ of sensor A.</w:t>
+        <w:t>The two simple deterministic small-scale media tested change this substantially. The sonic log at its 6-m resolution (L6) gives −1.28/−0.53, and the thin fracture zones (FZ) give −1.04/−0.39: under-prediction by factors of 19 and 11 at sensor A but only 3.4 and 2.4 at sensor B, where 41 % and 45 % of events fall within a factor of three. Averaging the log in 50-m blocks, as in the original analysis, therefore removed most of the late energy that the logged layering can generate. For the level of late energy, structure at the 5–10 m scale is the essential ingredient, whether it is layered, planar or random. Stochastic media span the observations: pink media with σ = 0.02 under-predict (−1.20/−0.49), σ = 0.09 is close at sensor A (−0.14) and σ = 0.045 at sensor B (+0.02), and the seed-11 stochastic media with σ = 0.13 over-predict (+0.28 to +1.12). The best stochastic media bring 53 % (A) and 54 % (B) of events within a factor of three. The residual scatter reflects the unknown realisation. No single medium matches the median at both sensors; for the pink family, sensor B requires about half the σ of sensor A.</w:t>
       </w:r>
     </w:p>
     <w:p>
@@ -4454,7 +4447,7 @@
       <w:r>
         <w:drawing>
           <wp:inline xmlns:a="http://schemas.openxmlformats.org/drawingml/2006/main" xmlns:pic="http://schemas.openxmlformats.org/drawingml/2006/picture">
-            <wp:extent cx="5940000" cy="3158596"/>
+            <wp:extent cx="5940000" cy="4258934"/>
             <wp:docPr id="3" name="Picture 3"/>
             <wp:cNvGraphicFramePr>
               <a:graphicFrameLocks noChangeAspect="1"/>
@@ -4475,7 +4468,7 @@
                   <pic:spPr>
                     <a:xfrm>
                       <a:off x="0" y="0"/>
-                      <a:ext cx="5940000" cy="3158596"/>
+                      <a:ext cx="5940000" cy="4258934"/>
                     </a:xfrm>
                     <a:prstGeom prst="rect"/>
                   </pic:spPr>
@@ -7182,7 +7175,7 @@
       <w:r>
         <w:drawing>
           <wp:inline xmlns:a="http://schemas.openxmlformats.org/drawingml/2006/main" xmlns:pic="http://schemas.openxmlformats.org/drawingml/2006/picture">
-            <wp:extent cx="5940000" cy="2362614"/>
+            <wp:extent cx="5940000" cy="2693756"/>
             <wp:docPr id="4" name="Picture 4"/>
             <wp:cNvGraphicFramePr>
               <a:graphicFrameLocks noChangeAspect="1"/>
@@ -7203,7 +7196,7 @@
                   <pic:spPr>
                     <a:xfrm>
                       <a:off x="0" y="0"/>
-                      <a:ext cx="5940000" cy="2362614"/>
+                      <a:ext cx="5940000" cy="2693756"/>
                     </a:xfrm>
                     <a:prstGeom prst="rect"/>
                   </pic:spPr>
@@ -8692,7 +8685,7 @@
       <w:r>
         <w:drawing>
           <wp:inline xmlns:a="http://schemas.openxmlformats.org/drawingml/2006/main" xmlns:pic="http://schemas.openxmlformats.org/drawingml/2006/picture">
-            <wp:extent cx="5940000" cy="2081324"/>
+            <wp:extent cx="5940000" cy="2062542"/>
             <wp:docPr id="5" name="Picture 5"/>
             <wp:cNvGraphicFramePr>
               <a:graphicFrameLocks noChangeAspect="1"/>
@@ -8713,7 +8706,7 @@
                   <pic:spPr>
                     <a:xfrm>
                       <a:off x="0" y="0"/>
-                      <a:ext cx="5940000" cy="2081324"/>
+                      <a:ext cx="5940000" cy="2062542"/>
                     </a:xfrm>
                     <a:prstGeom prst="rect"/>
                   </pic:spPr>
@@ -8804,7 +8797,7 @@
           <w:b w:val="0"/>
           <w:i w:val="0"/>
         </w:rPr>
-        <w:t>. Because the doubled sponge has a much smaller effect, this is not a boundary artefact. It reflects the larger scattering volume: in the reference domain the event cloud nearly fills the interior, so heterogeneity beyond it lies in the absorbing sponge and returns no scattered energy. A smooth medium has no such scatterers, so the smooth-model deficit is unaffected. The slower decay in the larger domain may also explain why the observed coda decayed more slowly than the simulated coda in the original analysis. For the stochastic media, the reference domain underestimates the late energy, and the effective scattering strength derived below is an upper bound. With the sensitivity of the median ratio to σ found below (0.80 log units per unit change of ln σ), the domain effect corresponds to σ</w:t>
+        <w:t>. Because the doubled sponge has a much smaller effect, this is not a boundary artefact. It reflects the larger scattering volume: in the reference domain the event cloud nearly fills the interior, so heterogeneity beyond it lies in the absorbing sponge and returns no scattered energy. A smooth medium has no such scatterers, so the smooth-model deficit is unaffected. The slower decay in the larger domain may also explain why the observed coda decayed more slowly than the simulated coda in the original analysis. For the stochastic media, the reference domain probably underestimates the late energy, and the effective scattering strength derived below is probably an upper bound. With the sensitivity of the median ratio to σ found below (0.80 log units per unit change of ln σ), this single test implies that σ</w:t>
       </w:r>
       <w:r>
         <w:rPr>
@@ -8819,7 +8812,7 @@
           <w:b w:val="0"/>
           <w:i w:val="0"/>
         </w:rPr>
-        <w:t xml:space="preserve"> values about 1.7 times too large.</w:t>
+        <w:t xml:space="preserve"> from the reference domain may be overestimated by a factor of about 1.7. Whether the same factor applies to other families and to sensor A was not tested.</w:t>
       </w:r>
     </w:p>
     <w:p>
@@ -9223,7 +9216,7 @@
       <w:r>
         <w:drawing>
           <wp:inline xmlns:a="http://schemas.openxmlformats.org/drawingml/2006/main" xmlns:pic="http://schemas.openxmlformats.org/drawingml/2006/picture">
-            <wp:extent cx="5940000" cy="2536046"/>
+            <wp:extent cx="5940000" cy="3124246"/>
             <wp:docPr id="6" name="Picture 6"/>
             <wp:cNvGraphicFramePr>
               <a:graphicFrameLocks noChangeAspect="1"/>
@@ -9244,7 +9237,7 @@
                   <pic:spPr>
                     <a:xfrm>
                       <a:off x="0" y="0"/>
-                      <a:ext cx="5940000" cy="2536046"/>
+                      <a:ext cx="5940000" cy="3124246"/>
                     </a:xfrm>
                     <a:prstGeom prst="rect"/>
                   </pic:spPr>
@@ -9309,7 +9302,7 @@
           <w:b w:val="0"/>
           <w:i w:val="0"/>
         </w:rPr>
-        <w:t>; dotted lines: factor of three; grey band: range of the smooth baselines.</w:t>
+        <w:t>; dotted lines: factor of three; grey band: range of the smooth media; purple dash-dotted and dashed lines: 6-m layering (L6) and fracture zones (FZ).</w:t>
       </w:r>
     </w:p>
     <w:p>
@@ -9329,7 +9322,31 @@
           <w:b w:val="0"/>
           <w:i w:val="0"/>
         </w:rPr>
-        <w:t>Fig. 7 shows D2 with cluster-bootstrap intervals. The observed coda of neighbouring events is moderately coherent (0.69 at sensor A and 0.75 at B for 0–5 m) and decorrelates to 0.49 and 0.48 at 80–160 m. In the smooth media the coda remains coherent (0.79–0.85 at 80–160 m, sensor A; 0.71–0.78 at B), and their 95 % intervals lie above the data interval in every bin from 5 m separation at sensor A and from 20 m at sensor B. The deterministic small-scale media stay as coherent as the smooth media at sensor A (0.79–0.82) and decorrelate only partly at sensor B (0.65–0.67); their intervals lie above the data from 5 m (A) and 20 m (B). Thin layers and planar fracture zones thus add late energy, but energy that is similar for neighbouring events, because it is generated by the same few structures along similar paths. Stochastic media decorrelate as the data do, although most stay more coherent than the data at 10–40 m. Perturbing the hypocentres by 10 m changes the observed medians by ≤ 0.08. The 0–5 m bin contains only 64 pairs from 96 events, and its interval is wide. D2 is measured on the same records as the late energy, so it is a second descriptor of the same data, not an independent experiment. It does, however, discriminate between the media that the late-energy level alone cannot separate: it requires the scattering structure to vary on the scale of the event separations, as 3-D random heterogeneity does and a few deterministic layers or planes do not.</w:t>
+        <w:t>Fig. 7 shows D2 in the three windows. In the early coda (S + 15 to S + 100 ms) the observed coherence falls from 0.69 at 0–5 m to 0.49 at 80–160 m (sensor A; 0.75 to 0.48 at B). The smooth media stay coherent (all pairs within 160 m: 0.82–0.86 at A, 0.73–0.78 at B, against 0.50 at both sensors for the data), and so do the two deterministic small-scale media (0.80–0.83 and 0.67–0.69). The stochastic media decorrelate as the data do (0.48–0.59 and 0.54–0.62). This window, however, contains the tail of the S pulse and is close to the window of the source fit.</w:t>
+      </w:r>
+    </w:p>
+    <w:p>
+      <w:pPr>
+        <w:jc w:val="both"/>
+      </w:pPr>
+      <w:r>
+        <w:rPr>
+          <w:b w:val="0"/>
+          <w:i w:val="0"/>
+        </w:rPr>
+        <w:t>In the late windows the picture changes. All coherences are lower and approach the coherence of noise alone (0.57 at A and 0.48 at B). The observed late coda is at or below this level (0.53 and 0.45 for S + 40 to S + 100 ms; 0.54 and 0.45 for S + 50 to S + 110 ms). Because the synthetics carry the same noise, D2 in these windows measures how much coherent late energy a medium adds. The smooth media (0.60–0.69 at A, 0.53–0.58 at B) and the fracture zones (0.64, 0.62) remain more coherent than the data in both late windows; their 95 % intervals lie above the data interval in 19 of 20 medium–sensor–window cases (Additional file 1: Table S17). The stochastic media (0.49–0.55, 0.49–0.50) and the 6-m layering (0.57, 0.52) come closest; in S + 50 to S + 110 ms the 6-m layering is as close to the data as the stochastic media at sensor A (0.51 against 0.50–0.52 and 0.54 observed). In the pure late coda D2 therefore separates the data from the smooth media and from the planar fracture zones, but not from fine 1-D layering. The separation of distributed 3-D heterogeneity from fine layering rests on the early-coda window and is correspondingly less secure.</w:t>
+      </w:r>
+    </w:p>
+    <w:p>
+      <w:pPr>
+        <w:jc w:val="both"/>
+      </w:pPr>
+      <w:r>
+        <w:rPr>
+          <w:b w:val="0"/>
+          <w:i w:val="0"/>
+        </w:rPr>
+        <w:t>Location error does not change these conclusions. Perturbing the hypocentres of data and media by up to 50 m flattens the binned curves, as expected, but changes the observed medians at separations of 20 m or more by at most 0.05 (Additional file 1: Fig. S10), and the all-pairs levels, which do not depend on the binning, are unaffected. We therefore do not use the 0–5 and 5–10 m bins for inference (the 0–5 m bin contains only 64 pairs from 96 events). D2 is measured on the same records as the late energy, so it is a second descriptor of the same data, not an independent experiment.</w:t>
       </w:r>
     </w:p>
     <w:p>
@@ -9339,7 +9356,7 @@
       <w:r>
         <w:drawing>
           <wp:inline xmlns:a="http://schemas.openxmlformats.org/drawingml/2006/main" xmlns:pic="http://schemas.openxmlformats.org/drawingml/2006/picture">
-            <wp:extent cx="5940000" cy="2572988"/>
+            <wp:extent cx="5940000" cy="4502057"/>
             <wp:docPr id="7" name="Picture 7"/>
             <wp:cNvGraphicFramePr>
               <a:graphicFrameLocks noChangeAspect="1"/>
@@ -9348,7 +9365,7 @@
               <a:graphicData uri="http://schemas.openxmlformats.org/drawingml/2006/picture">
                 <pic:pic>
                   <pic:nvPicPr>
-                    <pic:cNvPr id="0" name="fig_d2_uncertainty.png"/>
+                    <pic:cNvPr id="0" name="fig_d2_windows.png"/>
                     <pic:cNvPicPr/>
                   </pic:nvPicPr>
                   <pic:blipFill>
@@ -9360,7 +9377,7 @@
                   <pic:spPr>
                     <a:xfrm>
                       <a:off x="0" y="0"/>
-                      <a:ext cx="5940000" cy="2572988"/>
+                      <a:ext cx="5940000" cy="4502057"/>
                     </a:xfrm>
                     <a:prstGeom prst="rect"/>
                   </pic:spPr>
@@ -9383,7 +9400,7 @@
           <w:b/>
           <w:i w:val="0"/>
         </w:rPr>
-        <w:t>Inter-event coda coherence with cluster-bootstrap uncertainty</w:t>
+        <w:t>Inter-event coda coherence in early and late coda windows</w:t>
       </w:r>
     </w:p>
     <w:p>
@@ -9395,7 +9412,7 @@
           <w:b w:val="0"/>
           <w:i w:val="0"/>
         </w:rPr>
-        <w:t>a) Sensor A. b) Sensor B. Median coherence of the 40–80 Hz coda (S + 15 to S + 100 ms) versus inter-event separation, with 95 % cluster-bootstrap intervals over events. Black: FORGE; dashed: FORGE with hypocentres perturbed by 10 m; grey: smooth media (H, L, GRAD3, A); purple: 6-m layering (L6) and fracture zones (FZ); orange: pink (σ = 0.09, 0.13); blue: exponential (</w:t>
+        <w:t>Median coherence of the 40–80 Hz coda versus inter-event separation, with 95 % cluster-bootstrap intervals over events, for sensor A (a–c) and sensor B (d–f), in the windows S + 15 to S + 100 ms (a, d), S + 40 to S + 100 ms (b, e) and S + 50 to S + 110 ms (c, f). Black: FORGE; dotted: FORGE noise-only window (S + 550 to S + 610 ms); grey: smooth media (H, L, GRAD3, A); purple: 6-m layering and fracture zones; orange: pink (σ = 0.09, 0.13); blue: exponential (</w:t>
       </w:r>
       <w:r>
         <w:rPr>
@@ -9603,7 +9620,7 @@
       <w:r>
         <w:drawing>
           <wp:inline xmlns:a="http://schemas.openxmlformats.org/drawingml/2006/main" xmlns:pic="http://schemas.openxmlformats.org/drawingml/2006/picture">
-            <wp:extent cx="5940000" cy="2207182"/>
+            <wp:extent cx="5940000" cy="5056414"/>
             <wp:docPr id="8" name="Picture 8"/>
             <wp:cNvGraphicFramePr>
               <a:graphicFrameLocks noChangeAspect="1"/>
@@ -9624,7 +9641,7 @@
                   <pic:spPr>
                     <a:xfrm>
                       <a:off x="0" y="0"/>
-                      <a:ext cx="5940000" cy="2207182"/>
+                      <a:ext cx="5940000" cy="5056414"/>
                     </a:xfrm>
                     <a:prstGeom prst="rect"/>
                   </pic:spPr>
@@ -9659,7 +9676,35 @@
           <w:b w:val="0"/>
           <w:i w:val="0"/>
         </w:rPr>
-        <w:t xml:space="preserve">a) Φ for all media with the full event set (circles) and 95 % event-bootstrap intervals (bars), sorted by Φ. Grey: smooth media; purple: deterministic small-scale media; orange: pink; light orange: variable </w:t>
+        <w:t xml:space="preserve">a) Φ for all media with the full event set (circles) and 95 % event-bootstrap intervals (bars), sorted by Φ. Labels give family, σ, </w:t>
+      </w:r>
+      <w:r>
+        <w:rPr>
+          <w:b w:val="0"/>
+          <w:i/>
+        </w:rPr>
+        <w:t>p</w:t>
+      </w:r>
+      <w:r>
+        <w:rPr>
+          <w:b w:val="0"/>
+          <w:i w:val="0"/>
+        </w:rPr>
+        <w:t xml:space="preserve"> or </w:t>
+      </w:r>
+      <w:r>
+        <w:rPr>
+          <w:b w:val="0"/>
+          <w:i/>
+        </w:rPr>
+        <w:t>a</w:t>
+      </w:r>
+      <w:r>
+        <w:rPr>
+          <w:b w:val="0"/>
+          <w:i w:val="0"/>
+        </w:rPr>
+        <w:t xml:space="preserve"> (m) and white-noise seed (s11, s33). Grey: smooth media; purple: deterministic small-scale media; orange: pink; light orange: variable </w:t>
       </w:r>
       <w:r>
         <w:rPr>
@@ -9759,7 +9804,7 @@
           <w:b w:val="0"/>
           <w:i w:val="0"/>
         </w:rPr>
-        <w:t xml:space="preserve"> = 50 m). The intervals reflect event resampling only, not realisation scatter. b) Held-out Φ of each family's best training member over 21 splits in both directions.</w:t>
+        <w:t xml:space="preserve"> = 50 m). The intervals reflect event resampling only, not realisation scatter. b) Held-out Φ of each family's best training member over 21 splits in both directions (box: interquartile range; whiskers: range).</w:t>
       </w:r>
     </w:p>
     <w:p>
@@ -9789,7 +9834,7 @@
       <w:r>
         <w:drawing>
           <wp:inline xmlns:a="http://schemas.openxmlformats.org/drawingml/2006/main" xmlns:pic="http://schemas.openxmlformats.org/drawingml/2006/picture">
-            <wp:extent cx="5940000" cy="2277000"/>
+            <wp:extent cx="5940000" cy="2387562"/>
             <wp:docPr id="9" name="Picture 9"/>
             <wp:cNvGraphicFramePr>
               <a:graphicFrameLocks noChangeAspect="1"/>
@@ -9810,7 +9855,7 @@
                   <pic:spPr>
                     <a:xfrm>
                       <a:off x="0" y="0"/>
-                      <a:ext cx="5940000" cy="2277000"/>
+                      <a:ext cx="5940000" cy="2387562"/>
                     </a:xfrm>
                     <a:prstGeom prst="rect"/>
                   </pic:spPr>
@@ -9859,7 +9904,7 @@
           <w:b w:val="0"/>
           <w:i w:val="0"/>
         </w:rPr>
-        <w:t xml:space="preserve"> (grey) and log-binned values (dots), with least-squares fits of a power law, exponential and Gaussian autocorrelation spectra and a power law with a corner. a) 12–200 m; the corner model converges to a pure power law and overlies it. b) 1–200 m. AIC values in the legend.</w:t>
+        <w:t xml:space="preserve"> (grey) and log-binned values (dots), with least-squares fits of a power law, exponential and Gaussian autocorrelation spectra and a power law with a corner (dashed). a) 12–200 m; the corner model converges to a pure power law and overlies it. b) 1–200 m. AIC values in the legend.</w:t>
       </w:r>
     </w:p>
     <w:p>
@@ -9887,7 +9932,7 @@
           <w:b w:val="0"/>
           <w:i w:val="0"/>
         </w:rPr>
-        <w:t>Media without structure below ~50 m (homogeneous, 50-m layering, smooth 3-D gradients, VTI) produce one to two orders of magnitude less late S energy than recorded, event by event. This deficit survives non-overlapping windows, alternative source constraints, finite source duration, S-timing selection and a bounded single-resonance ringing model, and the simulated coda is converged with respect to grid and absorbing boundary. Deterministic structure at the 5–10 m scale, either the logged layering at full resolution or thin planar fracture zones, produces much of the missing energy, particularly at the deeper sensor. Such structure keeps the coda of neighbouring events coherent, however, whereas the observed coda decorrelates. Stochastic 3-D media reproduce both the level and the decorrelation. What remains true if the term "pink noise" is removed from this paper is therefore: within elastic modelling, the late S energy and its decorrelation in the 56-32 records require strong small-scale 3-D heterogeneity, unless an unmodelled site or coupling response of comparable size is present.</w:t>
+        <w:t>Media without structure below ~50 m (homogeneous, 50-m layering, smooth 3-D gradients, VTI) produce one to two orders of magnitude less late S energy than recorded, event by event. This deficit survives non-overlapping windows, alternative source constraints, finite source duration, S-timing selection and a bounded single-resonance ringing model, and the simulated coda is converged with respect to grid and absorbing boundary. The two simple deterministic media with structure at the 5–10 m scale that we tested, the logged layering at full resolution and twelve thin planar fracture zones, produce much of the missing energy, particularly at the deeper sensor. In the early coda such structure keeps neighbouring events coherent, whereas the observed coda decorrelates as in the stochastic media. In the pure late coda the planar fracture zones and the smooth media remain too coherent, but the 6-m layering and the stochastic media both approach the noise-limited coherence of the data. What remains true if the term "pink noise" is removed from this paper is therefore: within elastic modelling, the late S energy in the 56-32 records requires structure at the 5–10 m scale, and its decorrelation favours distributed 3-D heterogeneity over smooth media and planar fracture zones, without excluding fine layering, unless an unmodelled site or coupling response of comparable size is present.</w:t>
       </w:r>
     </w:p>
     <w:p>
@@ -10010,7 +10055,7 @@
           <w:b w:val="0"/>
           <w:i w:val="0"/>
         </w:rPr>
-        <w:t xml:space="preserve"> = 0.05–0.13, depending on sensor and family. The domain test suggests that these values are about 1.7 times too large. In the original analysis, the misfit optimum (σ ≈ 0.18) and the per-event optimum (σ ≈ 0.09–0.13) disagreed with the sonic log (0.045 at 6-m averaging) by up to a factor of four. With non-overlapping windows, all events, separate sensors and the domain effect, the discrepancy largely disappears. Adding the domain effect to the pink medium with the log value (σ = 0.045) gives median ratios of −0.33 (A) and +0.42 (B), within a factor of about 3 at both sensors. This agreement rests on one domain test at one sensor and should be read as consistency, not as a measurement.</w:t>
+        <w:t xml:space="preserve"> = 0.05–0.13, depending on sensor and family. One domain test (one medium, sensor B) suggests that these values may be about 1.7 times too large. In the original analysis, the misfit optimum (σ ≈ 0.18) and the per-event optimum (σ ≈ 0.09–0.13) disagreed with the sonic log (0.045 at 6-m averaging) by up to a factor of four. With non-overlapping windows, all events, separate sensors and the domain effect, the discrepancy is much reduced. Adding the domain effect to the pink medium with the log value (σ = 0.045) gives median ratios of −0.33 (A) and +0.42 (B), within a factor of about 3 at both sensors. This agreement rests on one domain test at one sensor and should be read as consistency, not as a measurement.</w:t>
       </w:r>
     </w:p>
     <w:p>
@@ -10088,7 +10133,7 @@
           <w:b w:val="0"/>
           <w:i w:val="0"/>
         </w:rPr>
-        <w:t>-weighted perturbation would produce similar late energy, and the fracture-zone medium shows that a few planar zones are not enough; neither shows that stimulated fractures produced the coda.</w:t>
+        <w:t>-weighted perturbation would produce similar late energy, and the fracture-zone medium shows that twelve planar zones are not enough; neither shows that stimulated fractures produced the coda. Denser 3-D fracture networks, rough interfaces, irregular damage zones and anisotropic compliance were not tested, and a sufficiently dense deterministic network would approach a random medium.</w:t>
       </w:r>
     </w:p>
     <w:p>
@@ -10108,7 +10153,7 @@
           <w:b w:val="0"/>
           <w:i w:val="0"/>
         </w:rPr>
-        <w:t>For microseismic practice, the result means that velocity models adequate for locating events at ~1-ms travel-time precision leave most of the late wavefield unexplained, and that even fine deterministic layering explains its level but not its spatial incoherence. The late wavefield carries information on small-scale 3-D structure, but it must be compared statistically, because the realisation cannot be recovered from two sensors. For the GFI concept, the result is necessary but not sufficient. Strong small-scale 3-D heterogeneity is required, and a lognormal power-law medium with roughly the logged σ provides it. The present seismic data do not, however, distinguish it from media with a short correlation length. Decisive tests of spectral shape need records at more stations, measured sensor transfer functions, larger simulation domains, and simulations above 100 Hz, where the families differ most. The 4-kHz FORGE records contain S energy above noise up to about 1.8 kHz (Additional file 1: Figs. S5, S6), but fixed-frequency tool resonances near 330, 480 and 920 Hz currently prevent interpreting that band as source or path energy.</w:t>
+        <w:t>For microseismic practice, the result means that velocity models adequate for locating events at ~1-ms travel-time precision leave most of the late wavefield unexplained. Fine deterministic layering can supply much of its level, and its spatial incoherence is matched best, though not uniquely, by distributed 3-D heterogeneity. The late wavefield carries information on small-scale structure, but it must be compared statistically, because the realisation cannot be recovered from two sensors. For the GFI concept, the result is consistent but not decisive. Strong small-scale heterogeneity is required, and a lognormal power-law medium with roughly the logged σ provides it. The present seismic data do not, however, distinguish it from media with a short correlation length, nor fully from fine layering. Decisive tests of spectral shape need records at more stations, measured sensor transfer functions, larger simulation domains, and simulations above 100 Hz, where the families differ most. The 4-kHz FORGE records contain S energy above noise up to about 1.8 kHz (Additional file 1: Figs. S5, S6), but fixed-frequency tool resonances near 330, 480 and 920 Hz currently prevent interpreting that band as source or path energy.</w:t>
       </w:r>
     </w:p>
     <w:p>
@@ -10279,6 +10324,19 @@
     </w:p>
     <w:p>
       <w:pPr>
+        <w:pStyle w:val="ListBullet"/>
+        <w:jc w:val="both"/>
+      </w:pPr>
+      <w:r>
+        <w:rPr>
+          <w:b w:val="0"/>
+          <w:i w:val="0"/>
+        </w:rPr>
+        <w:t>In the pure late coda the inter-event coherence is limited by noise and does not separate fine layering from distributed heterogeneity.</w:t>
+      </w:r>
+    </w:p>
+    <w:p>
+      <w:pPr>
         <w:pStyle w:val="Heading1"/>
       </w:pPr>
       <w:r>
@@ -10308,7 +10366,7 @@
           <w:b w:val="0"/>
           <w:i w:val="0"/>
         </w:rPr>
-        <w:t>Deterministic 5–10 m structure (6-m sonic-log layering, thin fracture zones) supplies much of the late energy, but keeps the coda of neighbouring events coherent, whereas the observed coda decorrelates.</w:t>
+        <w:t>The tested simple deterministic 5–10 m structures (6-m sonic-log layering, twelve thin fracture zones) supply much of the late energy. In the early coda they keep neighbouring events more coherent than observed; in the pure late coda, where coherence is limited by noise, only the smooth media and the fracture zones remain distinguishable from the data.</w:t>
       </w:r>
     </w:p>
     <w:p>
@@ -10321,7 +10379,7 @@
           <w:b w:val="0"/>
           <w:i w:val="0"/>
         </w:rPr>
-        <w:t>Stochastic 3-D media reproduce both descriptors, with an effective scattering strength σ</w:t>
+        <w:t>Stochastic 3-D media span the observed late energy and reproduce the loss of inter-event coherence more closely than the other tested media, with an effective scattering strength σ</w:t>
       </w:r>
       <w:r>
         <w:rPr>
@@ -10336,7 +10394,7 @@
           <w:b w:val="0"/>
           <w:i w:val="0"/>
         </w:rPr>
-        <w:t xml:space="preserve"> = 0.05–0.13 in the reference domain. A larger domain lowers this by a factor of about 1.7, towards the sonic-log value of 0.045.</w:t>
+        <w:t xml:space="preserve"> = 0.05–0.13 in the reference domain. In one sensor-B sensitivity test, enlarging the domain implied that these values may be overestimated by a factor of about 1.7, which would bring them close to the sonic-log value of 0.045.</w:t>
       </w:r>
     </w:p>
     <w:p>
@@ -10382,7 +10440,7 @@
           <w:b w:val="0"/>
           <w:i w:val="0"/>
         </w:rPr>
-        <w:t>Additional file 1: Figures S1–S12 and Tables S1–S16 (reciprocity validation, sonic log, earlier statistical and shape tests, bandwidth and multi-octave diagnostics, window and moment-tensor sensitivity, S-timing subsets, calibration bootstrap, source spectra, ringing tests, stage comparison, field statistics, numerical convergence, σ</w:t>
+        <w:t>Additional file 1: Figures S1–S11 and Tables S1–S18 (reciprocity validation, sonic log, earlier statistical tests, bandwidth and multi-octave diagnostics, location stress test of the coda coherence, window and moment-tensor sensitivity, S-timing subsets, calibration bootstrap, source spectra, ringing tests, stage comparison, field statistics, numerical convergence, σ</w:t>
       </w:r>
       <w:r>
         <w:rPr>
@@ -10397,7 +10455,7 @@
           <w:b w:val="0"/>
           <w:i w:val="0"/>
         </w:rPr>
-        <w:t xml:space="preserve"> curves, complete Φ and holdout tables, equal-σ truth tests, log-spectrum variants and per-event results for every medium and seed).</w:t>
+        <w:t xml:space="preserve"> curves, complete Φ and holdout tables, equal-σ truth tests, log-spectrum variants, per-event results for every medium and seed, and coda-coherence tables).</w:t>
       </w:r>
     </w:p>
     <w:p>
@@ -10417,7 +10475,7 @@
           <w:b w:val="0"/>
           <w:i w:val="0"/>
         </w:rPr>
-        <w:t>The GES 2022 catalogue is public [10]. The 56-32 SEG-2 records were provided to the authors; their public release is being confirmed with the data owner. All code (FD solver, reciprocity, features, tests; random seeds are fixed in the scripts) and derived result tables are at https://github.com/maswiet/Paper2_PinkNoise_WaveformInversion [COMMIT HASH AND ARCHIVE DOI TO BE ADDED AT SUBMISSION].</w:t>
+        <w:t>The GES 2022 event catalogue is publicly available [10]. The 2022 56-32 SEG-2 downhole records are available from Utah FORGE and Geo-Energie Suisse on reasonable request. All code (FD solver, reciprocity, feature extraction, tests and figure scripts, with fixed random seeds) and all derived result tables are available at https://github.com/maswiet/Paper2_PinkNoise_WaveformInversion, release v1.0-submission (commit 1dab05b).</w:t>
       </w:r>
     </w:p>
     <w:p>
@@ -10437,7 +10495,7 @@
           <w:b w:val="0"/>
           <w:i w:val="0"/>
         </w:rPr>
-        <w:t>[TO BE COMPLETED BY AUTHORS]</w:t>
+        <w:t>The authors declare that they have no competing interests.</w:t>
       </w:r>
     </w:p>
     <w:p>
@@ -10457,7 +10515,7 @@
           <w:b w:val="0"/>
           <w:i w:val="0"/>
         </w:rPr>
-        <w:t>[TO BE COMPLETED BY AUTHORS]</w:t>
+        <w:t>This research received no specific grant from any funding agency in the public, commercial or not-for-profit sectors.</w:t>
       </w:r>
     </w:p>
     <w:p>
@@ -10477,7 +10535,7 @@
           <w:b w:val="0"/>
           <w:i w:val="0"/>
         </w:rPr>
-        <w:t>[TO BE COMPLETED BY AUTHORS]</w:t>
+        <w:t>WS: conceptualisation, methodology, software, formal analysis, investigation, data curation, visualisation, writing – original draft. PL: conceptualisation of the geoflow-imaging (GFI) framework and of the pink-noise crustal model, methodology, writing – review and editing. Both authors read and approved the final manuscript.</w:t>
       </w:r>
     </w:p>
     <w:p>
@@ -10497,7 +10555,7 @@
           <w:b w:val="0"/>
           <w:i w:val="0"/>
         </w:rPr>
-        <w:t>We thank Heiner Igel for the acoustic finite-difference MATLAB codes from which the elastic solver used here was developed. [FURTHER ACKNOWLEDGEMENTS TO BE COMPLETED BY AUTHORS]</w:t>
+        <w:t>We thank Heiner Igel for the acoustic finite-difference MATLAB codes from which the elastic solver used here was developed, Geo-Energie Suisse and the Utah FORGE project of the U.S. Department of Energy for the event catalogue and the downhole records, and an internal reviewer for a critical reading of earlier versions.</w:t>
       </w:r>
     </w:p>
     <w:p>

</xml_diff>